<commit_message>
> [resources/documents/report.docx] - add constructions for paste text with docxtpl
</commit_message>
<xml_diff>
--- a/resources/documents/report.docx
+++ b/resources/documents/report.docx
@@ -1,13 +1,11 @@
 
 <file path=word/document.xml><?xml version="1.0" encoding="utf-8"?>
-<w:document xmlns:o="urn:schemas-microsoft-com:office:office" xmlns:r="http://schemas.openxmlformats.org/officeDocument/2006/relationships" xmlns:v="urn:schemas-microsoft-com:vml" xmlns:w="http://schemas.openxmlformats.org/wordprocessingml/2006/main" xmlns:w10="urn:schemas-microsoft-com:office:word" xmlns:wp="http://schemas.openxmlformats.org/drawingml/2006/wordprocessingDrawing" xmlns:wps="http://schemas.microsoft.com/office/word/2010/wordprocessingShape" xmlns:wpg="http://schemas.microsoft.com/office/word/2010/wordprocessingGroup" xmlns:mc="http://schemas.openxmlformats.org/markup-compatibility/2006" xmlns:wp14="http://schemas.microsoft.com/office/word/2010/wordprocessingDrawing" xmlns:w14="http://schemas.microsoft.com/office/word/2010/wordml" xmlns:w15="http://schemas.microsoft.com/office/word/2012/wordml" mc:Ignorable="w14 wp14 w15">
+<w:document xmlns:wpc="http://schemas.microsoft.com/office/word/2010/wordprocessingCanvas" xmlns:cx="http://schemas.microsoft.com/office/drawing/2014/chartex" xmlns:cx1="http://schemas.microsoft.com/office/drawing/2015/9/8/chartex" xmlns:cx2="http://schemas.microsoft.com/office/drawing/2015/10/21/chartex" xmlns:cx3="http://schemas.microsoft.com/office/drawing/2016/5/9/chartex" xmlns:cx4="http://schemas.microsoft.com/office/drawing/2016/5/10/chartex" xmlns:cx5="http://schemas.microsoft.com/office/drawing/2016/5/11/chartex" xmlns:cx6="http://schemas.microsoft.com/office/drawing/2016/5/12/chartex" xmlns:cx7="http://schemas.microsoft.com/office/drawing/2016/5/13/chartex" xmlns:cx8="http://schemas.microsoft.com/office/drawing/2016/5/14/chartex" xmlns:mc="http://schemas.openxmlformats.org/markup-compatibility/2006" xmlns:aink="http://schemas.microsoft.com/office/drawing/2016/ink" xmlns:am3d="http://schemas.microsoft.com/office/drawing/2017/model3d" xmlns:o="urn:schemas-microsoft-com:office:office" xmlns:r="http://schemas.openxmlformats.org/officeDocument/2006/relationships" xmlns:m="http://schemas.openxmlformats.org/officeDocument/2006/math" xmlns:v="urn:schemas-microsoft-com:vml" xmlns:wp14="http://schemas.microsoft.com/office/word/2010/wordprocessingDrawing" xmlns:wp="http://schemas.openxmlformats.org/drawingml/2006/wordprocessingDrawing" xmlns:w10="urn:schemas-microsoft-com:office:word" xmlns:w="http://schemas.openxmlformats.org/wordprocessingml/2006/main" xmlns:w14="http://schemas.microsoft.com/office/word/2010/wordml" xmlns:w15="http://schemas.microsoft.com/office/word/2012/wordml" xmlns:w16cex="http://schemas.microsoft.com/office/word/2018/wordml/cex" xmlns:w16cid="http://schemas.microsoft.com/office/word/2016/wordml/cid" xmlns:w16="http://schemas.microsoft.com/office/word/2018/wordml" xmlns:w16se="http://schemas.microsoft.com/office/word/2015/wordml/symex" xmlns:wpg="http://schemas.microsoft.com/office/word/2010/wordprocessingGroup" xmlns:wpi="http://schemas.microsoft.com/office/word/2010/wordprocessingInk" xmlns:wne="http://schemas.microsoft.com/office/word/2006/wordml" xmlns:wps="http://schemas.microsoft.com/office/word/2010/wordprocessingShape" mc:Ignorable="w14 w15 w16se w16cid w16 w16cex wp14">
   <w:body>
     <w:p>
       <w:pPr>
-        <w:pStyle w:val="Normal"/>
         <w:jc w:val="center"/>
         <w:rPr>
-          <w:b/>
           <w:b/>
         </w:rPr>
       </w:pPr>
@@ -20,39 +18,23 @@
     </w:p>
     <w:p>
       <w:pPr>
-        <w:pStyle w:val="Normal"/>
         <w:rPr>
-          <w:b/>
           <w:b/>
         </w:rPr>
       </w:pPr>
-      <w:r>
-        <w:rPr>
-          <w:b/>
-        </w:rPr>
-      </w:r>
     </w:p>
     <w:tbl>
       <w:tblPr>
         <w:tblStyle w:val="af1"/>
         <w:tblW w:w="9606" w:type="dxa"/>
-        <w:jc w:val="left"/>
-        <w:tblInd w:w="0" w:type="dxa"/>
         <w:tblLayout w:type="fixed"/>
-        <w:tblCellMar>
-          <w:top w:w="0" w:type="dxa"/>
-          <w:left w:w="108" w:type="dxa"/>
-          <w:bottom w:w="0" w:type="dxa"/>
-          <w:right w:w="108" w:type="dxa"/>
-        </w:tblCellMar>
-        <w:tblLook w:firstRow="1" w:noVBand="1" w:lastRow="0" w:firstColumn="1" w:lastColumn="0" w:noHBand="0" w:val="04a0"/>
+        <w:tblLook w:val="04A0" w:firstRow="1" w:lastRow="0" w:firstColumn="1" w:lastColumn="0" w:noHBand="0" w:noVBand="1"/>
       </w:tblPr>
       <w:tblGrid>
         <w:gridCol w:w="3223"/>
-        <w:gridCol w:w="6382"/>
+        <w:gridCol w:w="6383"/>
       </w:tblGrid>
       <w:tr>
-        <w:trPr/>
         <w:tc>
           <w:tcPr>
             <w:tcW w:w="3223" w:type="dxa"/>
@@ -65,25 +47,11 @@
           </w:tcPr>
           <w:p>
             <w:pPr>
-              <w:pStyle w:val="Normal"/>
-              <w:widowControl w:val="false"/>
-              <w:suppressAutoHyphens w:val="true"/>
-              <w:spacing w:before="0" w:after="200"/>
-              <w:jc w:val="left"/>
-              <w:rPr>
-                <w:rFonts w:cs=""/>
-                <w:kern w:val="0"/>
-                <w:szCs w:val="22"/>
-                <w:lang w:val="ru-RU" w:bidi="ar-SA"/>
-              </w:rPr>
-            </w:pPr>
-            <w:r>
-              <w:rPr>
-                <w:rFonts w:cs=""/>
-                <w:kern w:val="0"/>
-                <w:sz w:val="22"/>
-                <w:szCs w:val="22"/>
-                <w:lang w:val="ru-RU" w:bidi="ar-SA"/>
+              <w:widowControl w:val="0"/>
+            </w:pPr>
+            <w:r>
+              <w:rPr>
+                <w:sz w:val="22"/>
               </w:rPr>
               <w:t>Авторы</w:t>
             </w:r>
@@ -101,166 +69,44 @@
           </w:tcPr>
           <w:p>
             <w:pPr>
-              <w:pStyle w:val="Normal"/>
-              <w:widowControl w:val="false"/>
-              <w:suppressAutoHyphens w:val="true"/>
-              <w:spacing w:lineRule="auto" w:line="240" w:before="0" w:after="0"/>
-              <w:jc w:val="left"/>
+              <w:widowControl w:val="0"/>
+              <w:spacing w:after="0" w:line="240" w:lineRule="auto"/>
               <w:rPr>
                 <w:color w:val="C9211E"/>
-              </w:rPr>
-            </w:pPr>
-            <w:r>
-              <w:rPr>
-                <w:rFonts w:cs=""/>
-                <w:color w:val="C9211E"/>
-                <w:kern w:val="0"/>
+                <w:lang w:val="en-US"/>
+              </w:rPr>
+            </w:pPr>
+            <w:r>
+              <w:rPr>
+                <w:color w:val="000000" w:themeColor="text1"/>
                 <w:sz w:val="22"/>
                 <w:szCs w:val="24"/>
-                <w:lang w:val="ru-RU" w:bidi="ar-SA"/>
-              </w:rPr>
-              <w:t>Фамилия</w:t>
-            </w:r>
-            <w:r>
-              <w:rPr>
-                <w:rFonts w:cs=""/>
-                <w:color w:val="C9211E"/>
-                <w:kern w:val="0"/>
+                <w:lang w:val="en-US"/>
+              </w:rPr>
+              <w:t>{{</w:t>
+            </w:r>
+            <w:r>
+              <w:rPr>
+                <w:color w:val="000000" w:themeColor="text1"/>
                 <w:sz w:val="22"/>
                 <w:szCs w:val="24"/>
-                <w:lang w:val="ru-RU" w:bidi="ar-SA"/>
-              </w:rPr>
-              <w:t xml:space="preserve"> И.</w:t>
-            </w:r>
-            <w:r>
-              <w:rPr>
-                <w:rFonts w:cs=""/>
-                <w:color w:val="C9211E"/>
-                <w:kern w:val="0"/>
+                <w:lang w:val="en-US"/>
+              </w:rPr>
+              <w:t xml:space="preserve"> authors</w:t>
+            </w:r>
+            <w:r>
+              <w:rPr>
+                <w:color w:val="000000" w:themeColor="text1"/>
                 <w:sz w:val="22"/>
                 <w:szCs w:val="24"/>
-                <w:lang w:val="ru-RU" w:bidi="ar-SA"/>
-              </w:rPr>
-              <w:t>О</w:t>
-            </w:r>
-            <w:r>
-              <w:rPr>
-                <w:rFonts w:cs=""/>
-                <w:color w:val="C9211E"/>
-                <w:kern w:val="0"/>
-                <w:sz w:val="22"/>
-                <w:szCs w:val="24"/>
-                <w:lang w:val="ru-RU" w:bidi="ar-SA"/>
-              </w:rPr>
-              <w:t>.,</w:t>
-            </w:r>
-          </w:p>
-          <w:p>
-            <w:pPr>
-              <w:pStyle w:val="Normal"/>
-              <w:widowControl w:val="false"/>
-              <w:suppressAutoHyphens w:val="true"/>
-              <w:spacing w:lineRule="auto" w:line="240" w:before="0" w:after="0"/>
-              <w:jc w:val="left"/>
-              <w:rPr>
-                <w:color w:val="C9211E"/>
-              </w:rPr>
-            </w:pPr>
-            <w:r>
-              <w:rPr>
-                <w:rFonts w:cs=""/>
-                <w:color w:val="C9211E"/>
-                <w:kern w:val="0"/>
-                <w:sz w:val="22"/>
-                <w:szCs w:val="24"/>
-                <w:lang w:val="ru-RU" w:bidi="ar-SA"/>
-              </w:rPr>
-              <w:t>Фамилия И.О.,</w:t>
-            </w:r>
-          </w:p>
-          <w:p>
-            <w:pPr>
-              <w:pStyle w:val="Normal"/>
-              <w:widowControl w:val="false"/>
-              <w:suppressAutoHyphens w:val="true"/>
-              <w:spacing w:lineRule="auto" w:line="240" w:before="0" w:after="0"/>
-              <w:jc w:val="left"/>
-              <w:rPr>
-                <w:color w:val="C9211E"/>
-              </w:rPr>
-            </w:pPr>
-            <w:r>
-              <w:rPr>
-                <w:rFonts w:cs=""/>
-                <w:color w:val="C9211E"/>
-                <w:kern w:val="0"/>
-                <w:sz w:val="22"/>
-                <w:szCs w:val="24"/>
-                <w:lang w:val="ru-RU" w:bidi="ar-SA"/>
-              </w:rPr>
-              <w:t xml:space="preserve">… </w:t>
-            </w:r>
-          </w:p>
-          <w:p>
-            <w:pPr>
-              <w:pStyle w:val="Normal"/>
-              <w:widowControl w:val="false"/>
-              <w:suppressAutoHyphens w:val="true"/>
-              <w:spacing w:lineRule="auto" w:line="240" w:before="0" w:after="0"/>
-              <w:jc w:val="left"/>
-              <w:rPr>
-                <w:color w:val="C9211E"/>
-              </w:rPr>
-            </w:pPr>
-            <w:r>
-              <w:rPr>
-                <w:rFonts w:cs=""/>
-                <w:color w:val="C9211E"/>
-                <w:kern w:val="0"/>
-                <w:sz w:val="22"/>
-                <w:szCs w:val="24"/>
-                <w:lang w:val="ru-RU" w:bidi="ar-SA"/>
-              </w:rPr>
-              <w:t>Фамилия</w:t>
-            </w:r>
-            <w:r>
-              <w:rPr>
-                <w:rFonts w:cs=""/>
-                <w:color w:val="C9211E"/>
-                <w:kern w:val="0"/>
-                <w:sz w:val="22"/>
-                <w:szCs w:val="24"/>
-                <w:lang w:val="ru-RU" w:bidi="ar-SA"/>
-              </w:rPr>
-              <w:t xml:space="preserve"> И.</w:t>
-            </w:r>
-            <w:r>
-              <w:rPr>
-                <w:rFonts w:cs=""/>
-                <w:color w:val="C9211E"/>
-                <w:kern w:val="0"/>
-                <w:sz w:val="22"/>
-                <w:szCs w:val="24"/>
-                <w:lang w:val="ru-RU" w:bidi="ar-SA"/>
-              </w:rPr>
-              <w:t>О</w:t>
-            </w:r>
-            <w:r>
-              <w:rPr>
-                <w:rFonts w:cs=""/>
-                <w:color w:val="C9211E"/>
-                <w:kern w:val="0"/>
-                <w:sz w:val="22"/>
-                <w:szCs w:val="24"/>
-                <w:lang w:val="ru-RU" w:bidi="ar-SA"/>
-              </w:rPr>
-              <w:t>.</w:t>
+                <w:lang w:val="en-US"/>
+              </w:rPr>
+              <w:t xml:space="preserve"> }}</w:t>
             </w:r>
           </w:p>
         </w:tc>
       </w:tr>
       <w:tr>
-        <w:trPr/>
         <w:tc>
           <w:tcPr>
             <w:tcW w:w="3223" w:type="dxa"/>
@@ -273,25 +119,12 @@
           </w:tcPr>
           <w:p>
             <w:pPr>
-              <w:pStyle w:val="Normal"/>
-              <w:widowControl w:val="false"/>
-              <w:suppressAutoHyphens w:val="true"/>
+              <w:widowControl w:val="0"/>
               <w:spacing w:before="240" w:after="0"/>
-              <w:jc w:val="left"/>
-              <w:rPr>
-                <w:rFonts w:cs=""/>
-                <w:kern w:val="0"/>
-                <w:szCs w:val="22"/>
-                <w:lang w:val="ru-RU" w:bidi="ar-SA"/>
-              </w:rPr>
-            </w:pPr>
-            <w:r>
-              <w:rPr>
-                <w:rFonts w:cs=""/>
-                <w:kern w:val="0"/>
-                <w:sz w:val="22"/>
-                <w:szCs w:val="22"/>
-                <w:lang w:val="ru-RU" w:bidi="ar-SA"/>
+            </w:pPr>
+            <w:r>
+              <w:rPr>
+                <w:sz w:val="22"/>
               </w:rPr>
               <w:t>Правообладатель</w:t>
             </w:r>
@@ -309,33 +142,43 @@
           </w:tcPr>
           <w:p>
             <w:pPr>
-              <w:pStyle w:val="Normal"/>
-              <w:widowControl w:val="false"/>
-              <w:suppressAutoHyphens w:val="true"/>
+              <w:widowControl w:val="0"/>
               <w:spacing w:before="240" w:after="0"/>
-              <w:jc w:val="left"/>
               <w:rPr>
                 <w:color w:val="C9211E"/>
-                <w:lang w:val="ru-RU"/>
-              </w:rPr>
-            </w:pPr>
-            <w:r>
-              <w:rPr>
-                <w:rFonts w:cs=""/>
-                <w:color w:val="C9211E"/>
-                <w:kern w:val="0"/>
-                <w:sz w:val="22"/>
-                <w:szCs w:val="22"/>
-                <w:lang w:val="ru-RU" w:bidi="ar-SA"/>
-              </w:rPr>
-              <w:t>Фамилия И.О. или Название организации</w:t>
+                <w:lang w:val="en-US"/>
+              </w:rPr>
+            </w:pPr>
+            <w:r>
+              <w:rPr>
+                <w:color w:val="000000" w:themeColor="text1"/>
+                <w:sz w:val="22"/>
+                <w:lang w:val="en-US"/>
+              </w:rPr>
+              <w:t xml:space="preserve">{{ </w:t>
+            </w:r>
+            <w:r>
+              <w:rPr>
+                <w:color w:val="000000" w:themeColor="text1"/>
+                <w:sz w:val="22"/>
+                <w:lang w:val="en-US"/>
+              </w:rPr>
+              <w:t>copyright_holder</w:t>
+            </w:r>
+            <w:r>
+              <w:rPr>
+                <w:color w:val="000000" w:themeColor="text1"/>
+                <w:sz w:val="22"/>
+                <w:lang w:val="en-US"/>
+              </w:rPr>
+              <w:t xml:space="preserve"> }}</w:t>
             </w:r>
           </w:p>
         </w:tc>
       </w:tr>
       <w:tr>
         <w:trPr>
-          <w:trHeight w:val="645" w:hRule="atLeast"/>
+          <w:trHeight w:val="645"/>
         </w:trPr>
         <w:tc>
           <w:tcPr>
@@ -349,25 +192,12 @@
           </w:tcPr>
           <w:p>
             <w:pPr>
-              <w:pStyle w:val="Normal"/>
-              <w:widowControl w:val="false"/>
-              <w:suppressAutoHyphens w:val="true"/>
+              <w:widowControl w:val="0"/>
               <w:spacing w:before="240" w:after="0"/>
-              <w:jc w:val="left"/>
-              <w:rPr>
-                <w:rFonts w:cs=""/>
-                <w:kern w:val="0"/>
-                <w:szCs w:val="22"/>
-                <w:lang w:val="ru-RU" w:bidi="ar-SA"/>
-              </w:rPr>
-            </w:pPr>
-            <w:r>
-              <w:rPr>
-                <w:rFonts w:cs=""/>
-                <w:kern w:val="0"/>
-                <w:sz w:val="22"/>
-                <w:szCs w:val="22"/>
-                <w:lang w:val="ru-RU" w:bidi="ar-SA"/>
+            </w:pPr>
+            <w:r>
+              <w:rPr>
+                <w:sz w:val="22"/>
               </w:rPr>
               <w:t>Программа</w:t>
             </w:r>
@@ -385,31 +215,39 @@
           </w:tcPr>
           <w:p>
             <w:pPr>
-              <w:pStyle w:val="Normal"/>
-              <w:widowControl w:val="false"/>
-              <w:suppressAutoHyphens w:val="true"/>
-              <w:spacing w:lineRule="auto" w:line="240" w:before="240" w:after="0"/>
+              <w:widowControl w:val="0"/>
+              <w:spacing w:before="240" w:after="0" w:line="240" w:lineRule="auto"/>
               <w:jc w:val="both"/>
               <w:rPr>
                 <w:color w:val="C9211E"/>
-              </w:rPr>
-            </w:pPr>
-            <w:r>
-              <w:rPr>
-                <w:rFonts w:cs=""/>
-                <w:color w:val="C9211E"/>
-                <w:kern w:val="0"/>
-                <w:sz w:val="22"/>
-                <w:szCs w:val="24"/>
-                <w:lang w:val="ru-RU" w:bidi="ar-SA"/>
-              </w:rPr>
-              <w:t>Название программы ЭВМ</w:t>
+                <w:lang w:val="en-US"/>
+              </w:rPr>
+            </w:pPr>
+            <w:r>
+              <w:rPr>
+                <w:color w:val="000000" w:themeColor="text1"/>
+                <w:lang w:val="en-US"/>
+              </w:rPr>
+              <w:t xml:space="preserve">{{ </w:t>
+            </w:r>
+            <w:r>
+              <w:rPr>
+                <w:color w:val="000000" w:themeColor="text1"/>
+                <w:lang w:val="en-US"/>
+              </w:rPr>
+              <w:t>program_name</w:t>
+            </w:r>
+            <w:r>
+              <w:rPr>
+                <w:color w:val="000000" w:themeColor="text1"/>
+                <w:lang w:val="en-US"/>
+              </w:rPr>
+              <w:t xml:space="preserve"> }}</w:t>
             </w:r>
           </w:p>
         </w:tc>
       </w:tr>
       <w:tr>
-        <w:trPr/>
         <w:tc>
           <w:tcPr>
             <w:tcW w:w="3223" w:type="dxa"/>
@@ -422,25 +260,12 @@
           </w:tcPr>
           <w:p>
             <w:pPr>
-              <w:pStyle w:val="Normal"/>
-              <w:widowControl w:val="false"/>
-              <w:suppressAutoHyphens w:val="true"/>
+              <w:widowControl w:val="0"/>
               <w:spacing w:before="240" w:after="0"/>
-              <w:jc w:val="left"/>
-              <w:rPr>
-                <w:rFonts w:cs=""/>
-                <w:kern w:val="0"/>
-                <w:szCs w:val="22"/>
-                <w:lang w:val="ru-RU" w:bidi="ar-SA"/>
-              </w:rPr>
-            </w:pPr>
-            <w:r>
-              <w:rPr>
-                <w:rFonts w:cs=""/>
-                <w:kern w:val="0"/>
-                <w:sz w:val="22"/>
-                <w:szCs w:val="22"/>
-                <w:lang w:val="ru-RU" w:bidi="ar-SA"/>
+            </w:pPr>
+            <w:r>
+              <w:rPr>
+                <w:sz w:val="22"/>
               </w:rPr>
               <w:t>Аннотация</w:t>
             </w:r>
@@ -458,79 +283,42 @@
           </w:tcPr>
           <w:p>
             <w:pPr>
-              <w:pStyle w:val="Normal"/>
-              <w:widowControl w:val="false"/>
-              <w:suppressAutoHyphens w:val="true"/>
-              <w:spacing w:lineRule="auto" w:line="240" w:before="240" w:after="0"/>
+              <w:widowControl w:val="0"/>
+              <w:spacing w:before="240" w:after="0" w:line="240" w:lineRule="auto"/>
               <w:jc w:val="both"/>
               <w:rPr>
                 <w:color w:val="C9211E"/>
-                <w:sz w:val="22"/>
-              </w:rPr>
-            </w:pPr>
-            <w:r>
-              <w:rPr>
-                <w:rFonts w:cs=""/>
-                <w:color w:val="C9211E"/>
-                <w:kern w:val="0"/>
-                <w:sz w:val="22"/>
-                <w:szCs w:val="22"/>
-                <w:lang w:val="ru-RU" w:bidi="ar-SA"/>
-              </w:rPr>
-              <w:t>Для чего нужен модуль. Модуль используется для...</w:t>
-            </w:r>
-          </w:p>
-          <w:p>
-            <w:pPr>
-              <w:pStyle w:val="Normal"/>
-              <w:widowControl w:val="false"/>
-              <w:suppressAutoHyphens w:val="true"/>
-              <w:spacing w:lineRule="auto" w:line="240" w:before="240" w:after="0"/>
-              <w:jc w:val="both"/>
-              <w:rPr>
-                <w:color w:val="C9211E"/>
-                <w:sz w:val="22"/>
-              </w:rPr>
-            </w:pPr>
-            <w:r>
-              <w:rPr>
-                <w:rFonts w:cs=""/>
-                <w:color w:val="C9211E"/>
-                <w:kern w:val="0"/>
-                <w:sz w:val="22"/>
-                <w:szCs w:val="22"/>
-                <w:lang w:val="ru-RU" w:bidi="ar-SA"/>
-              </w:rPr>
-              <w:t xml:space="preserve">Что использует модуль для работы </w:t>
-            </w:r>
-          </w:p>
-          <w:p>
-            <w:pPr>
-              <w:pStyle w:val="Normal"/>
-              <w:widowControl w:val="false"/>
-              <w:suppressAutoHyphens w:val="true"/>
-              <w:spacing w:lineRule="auto" w:line="240" w:before="240" w:after="0"/>
-              <w:jc w:val="both"/>
-              <w:rPr>
-                <w:color w:val="C9211E"/>
-              </w:rPr>
-            </w:pPr>
-            <w:r>
-              <w:rPr>
-                <w:rFonts w:cs=""/>
-                <w:color w:val="C9211E"/>
-                <w:kern w:val="0"/>
-                <w:sz w:val="22"/>
-                <w:szCs w:val="24"/>
-                <w:lang w:val="ru-RU" w:bidi="ar-SA"/>
-              </w:rPr>
-              <w:t>Область применения данного модуля</w:t>
+                <w:lang w:val="en-US"/>
+              </w:rPr>
+            </w:pPr>
+            <w:r>
+              <w:rPr>
+                <w:color w:val="000000" w:themeColor="text1"/>
+                <w:sz w:val="22"/>
+                <w:lang w:val="en-US"/>
+              </w:rPr>
+              <w:t xml:space="preserve">{{ </w:t>
+            </w:r>
+            <w:r>
+              <w:rPr>
+                <w:color w:val="000000" w:themeColor="text1"/>
+                <w:sz w:val="22"/>
+                <w:lang w:val="en-US"/>
+              </w:rPr>
+              <w:t>annotation</w:t>
+            </w:r>
+            <w:r>
+              <w:rPr>
+                <w:color w:val="000000" w:themeColor="text1"/>
+                <w:sz w:val="22"/>
+                <w:lang w:val="en-US"/>
+              </w:rPr>
+              <w:t xml:space="preserve"> }}</w:t>
             </w:r>
           </w:p>
         </w:tc>
       </w:tr>
       <w:tr>
-        <w:trPr/>
         <w:tc>
           <w:tcPr>
             <w:tcW w:w="3223" w:type="dxa"/>
@@ -543,25 +331,12 @@
           </w:tcPr>
           <w:p>
             <w:pPr>
-              <w:pStyle w:val="Normal"/>
-              <w:widowControl w:val="false"/>
-              <w:suppressAutoHyphens w:val="true"/>
+              <w:widowControl w:val="0"/>
               <w:spacing w:before="240" w:after="0"/>
-              <w:jc w:val="left"/>
-              <w:rPr>
-                <w:rFonts w:cs=""/>
-                <w:kern w:val="0"/>
-                <w:szCs w:val="22"/>
-                <w:lang w:val="ru-RU" w:bidi="ar-SA"/>
-              </w:rPr>
-            </w:pPr>
-            <w:r>
-              <w:rPr>
-                <w:rFonts w:cs=""/>
-                <w:kern w:val="0"/>
-                <w:sz w:val="22"/>
-                <w:szCs w:val="22"/>
-                <w:lang w:val="ru-RU" w:bidi="ar-SA"/>
+            </w:pPr>
+            <w:r>
+              <w:rPr>
+                <w:sz w:val="22"/>
               </w:rPr>
               <w:t>Тип ЭВМ</w:t>
             </w:r>
@@ -579,31 +354,40 @@
           </w:tcPr>
           <w:p>
             <w:pPr>
-              <w:pStyle w:val="Normal"/>
-              <w:widowControl w:val="false"/>
-              <w:suppressAutoHyphens w:val="true"/>
+              <w:widowControl w:val="0"/>
               <w:spacing w:before="240" w:after="0"/>
-              <w:jc w:val="left"/>
               <w:rPr>
                 <w:color w:val="C9211E"/>
               </w:rPr>
             </w:pPr>
             <w:r>
               <w:rPr>
-                <w:rFonts w:cs=""/>
-                <w:color w:val="C9211E"/>
-                <w:kern w:val="0"/>
-                <w:sz w:val="22"/>
-                <w:szCs w:val="22"/>
-                <w:lang w:val="en-US" w:bidi="ar-SA"/>
-              </w:rPr>
-              <w:t>IBM PC-совместимые</w:t>
+                <w:color w:val="000000" w:themeColor="text1"/>
+                <w:sz w:val="22"/>
+                <w:lang w:val="en-US"/>
+              </w:rPr>
+              <w:t xml:space="preserve">{{ </w:t>
+            </w:r>
+            <w:r>
+              <w:rPr>
+                <w:color w:val="000000" w:themeColor="text1"/>
+                <w:sz w:val="22"/>
+                <w:lang w:val="en-US"/>
+              </w:rPr>
+              <w:t>computer_type</w:t>
+            </w:r>
+            <w:r>
+              <w:rPr>
+                <w:color w:val="000000" w:themeColor="text1"/>
+                <w:sz w:val="22"/>
+                <w:lang w:val="en-US"/>
+              </w:rPr>
+              <w:t xml:space="preserve"> }}</w:t>
             </w:r>
           </w:p>
         </w:tc>
       </w:tr>
       <w:tr>
-        <w:trPr/>
         <w:tc>
           <w:tcPr>
             <w:tcW w:w="3223" w:type="dxa"/>
@@ -616,25 +400,12 @@
           </w:tcPr>
           <w:p>
             <w:pPr>
-              <w:pStyle w:val="Normal"/>
-              <w:widowControl w:val="false"/>
-              <w:suppressAutoHyphens w:val="true"/>
+              <w:widowControl w:val="0"/>
               <w:spacing w:before="240" w:after="0"/>
-              <w:jc w:val="left"/>
-              <w:rPr>
-                <w:rFonts w:cs=""/>
-                <w:kern w:val="0"/>
-                <w:szCs w:val="22"/>
-                <w:lang w:val="ru-RU" w:bidi="ar-SA"/>
-              </w:rPr>
-            </w:pPr>
-            <w:r>
-              <w:rPr>
-                <w:rFonts w:cs=""/>
-                <w:kern w:val="0"/>
-                <w:sz w:val="22"/>
-                <w:szCs w:val="22"/>
-                <w:lang w:val="ru-RU" w:bidi="ar-SA"/>
+            </w:pPr>
+            <w:r>
+              <w:rPr>
+                <w:sz w:val="22"/>
               </w:rPr>
               <w:t>Язык</w:t>
             </w:r>
@@ -652,31 +423,41 @@
           </w:tcPr>
           <w:p>
             <w:pPr>
-              <w:pStyle w:val="Normal"/>
-              <w:widowControl w:val="false"/>
-              <w:suppressAutoHyphens w:val="true"/>
+              <w:widowControl w:val="0"/>
               <w:spacing w:before="240" w:after="0"/>
-              <w:jc w:val="left"/>
               <w:rPr>
                 <w:color w:val="C9211E"/>
-              </w:rPr>
-            </w:pPr>
-            <w:r>
-              <w:rPr>
-                <w:rFonts w:cs=""/>
-                <w:color w:val="C9211E"/>
-                <w:kern w:val="0"/>
-                <w:sz w:val="22"/>
-                <w:szCs w:val="22"/>
-                <w:lang w:val="ru-RU" w:bidi="ar-SA"/>
-              </w:rPr>
-              <w:t>С++</w:t>
+                <w:lang w:val="en-US"/>
+              </w:rPr>
+            </w:pPr>
+            <w:r>
+              <w:rPr>
+                <w:color w:val="000000" w:themeColor="text1"/>
+                <w:sz w:val="22"/>
+                <w:lang w:val="en-US"/>
+              </w:rPr>
+              <w:t xml:space="preserve">{{ </w:t>
+            </w:r>
+            <w:r>
+              <w:rPr>
+                <w:color w:val="000000" w:themeColor="text1"/>
+                <w:sz w:val="22"/>
+                <w:lang w:val="en-US"/>
+              </w:rPr>
+              <w:t>language</w:t>
+            </w:r>
+            <w:r>
+              <w:rPr>
+                <w:color w:val="000000" w:themeColor="text1"/>
+                <w:sz w:val="22"/>
+                <w:lang w:val="en-US"/>
+              </w:rPr>
+              <w:t xml:space="preserve"> }}</w:t>
             </w:r>
           </w:p>
         </w:tc>
       </w:tr>
       <w:tr>
-        <w:trPr/>
         <w:tc>
           <w:tcPr>
             <w:tcW w:w="3223" w:type="dxa"/>
@@ -689,25 +470,12 @@
           </w:tcPr>
           <w:p>
             <w:pPr>
-              <w:pStyle w:val="Normal"/>
-              <w:widowControl w:val="false"/>
-              <w:suppressAutoHyphens w:val="true"/>
+              <w:widowControl w:val="0"/>
               <w:spacing w:before="240" w:after="0"/>
-              <w:jc w:val="left"/>
-              <w:rPr>
-                <w:rFonts w:cs=""/>
-                <w:kern w:val="0"/>
-                <w:szCs w:val="22"/>
-                <w:lang w:val="ru-RU" w:bidi="ar-SA"/>
-              </w:rPr>
-            </w:pPr>
-            <w:r>
-              <w:rPr>
-                <w:rFonts w:cs=""/>
-                <w:kern w:val="0"/>
-                <w:sz w:val="22"/>
-                <w:szCs w:val="22"/>
-                <w:lang w:val="ru-RU" w:bidi="ar-SA"/>
+            </w:pPr>
+            <w:r>
+              <w:rPr>
+                <w:sz w:val="22"/>
               </w:rPr>
               <w:t>ОС</w:t>
             </w:r>
@@ -725,31 +493,40 @@
           </w:tcPr>
           <w:p>
             <w:pPr>
-              <w:pStyle w:val="Normal"/>
-              <w:widowControl w:val="false"/>
-              <w:suppressAutoHyphens w:val="true"/>
+              <w:widowControl w:val="0"/>
               <w:spacing w:before="240" w:after="0"/>
-              <w:jc w:val="left"/>
               <w:rPr>
                 <w:color w:val="C9211E"/>
               </w:rPr>
             </w:pPr>
             <w:r>
               <w:rPr>
-                <w:rFonts w:cs=""/>
-                <w:color w:val="C9211E"/>
-                <w:kern w:val="0"/>
-                <w:sz w:val="22"/>
-                <w:szCs w:val="22"/>
-                <w:lang w:val="en-US" w:bidi="ar-SA"/>
-              </w:rPr>
-              <w:t>Microsoft Windows, Linux</w:t>
+                <w:color w:val="000000" w:themeColor="text1"/>
+                <w:sz w:val="22"/>
+                <w:lang w:val="en-US"/>
+              </w:rPr>
+              <w:t xml:space="preserve">{{ </w:t>
+            </w:r>
+            <w:r>
+              <w:rPr>
+                <w:color w:val="000000" w:themeColor="text1"/>
+                <w:sz w:val="22"/>
+                <w:lang w:val="en-US"/>
+              </w:rPr>
+              <w:t>os</w:t>
+            </w:r>
+            <w:r>
+              <w:rPr>
+                <w:color w:val="000000" w:themeColor="text1"/>
+                <w:sz w:val="22"/>
+                <w:lang w:val="en-US"/>
+              </w:rPr>
+              <w:t xml:space="preserve"> }}</w:t>
             </w:r>
           </w:p>
         </w:tc>
       </w:tr>
       <w:tr>
-        <w:trPr/>
         <w:tc>
           <w:tcPr>
             <w:tcW w:w="3223" w:type="dxa"/>
@@ -762,25 +539,12 @@
           </w:tcPr>
           <w:p>
             <w:pPr>
-              <w:pStyle w:val="Normal"/>
-              <w:widowControl w:val="false"/>
-              <w:suppressAutoHyphens w:val="true"/>
+              <w:widowControl w:val="0"/>
               <w:spacing w:before="240" w:after="0"/>
-              <w:jc w:val="left"/>
-              <w:rPr>
-                <w:rFonts w:cs=""/>
-                <w:kern w:val="0"/>
-                <w:szCs w:val="22"/>
-                <w:lang w:val="ru-RU" w:bidi="ar-SA"/>
-              </w:rPr>
-            </w:pPr>
-            <w:r>
-              <w:rPr>
-                <w:rFonts w:cs=""/>
-                <w:kern w:val="0"/>
-                <w:sz w:val="22"/>
-                <w:szCs w:val="22"/>
-                <w:lang w:val="ru-RU" w:bidi="ar-SA"/>
+            </w:pPr>
+            <w:r>
+              <w:rPr>
+                <w:sz w:val="22"/>
               </w:rPr>
               <w:t>Объем программы</w:t>
             </w:r>
@@ -798,127 +562,135 @@
           </w:tcPr>
           <w:p>
             <w:pPr>
-              <w:pStyle w:val="Normal"/>
-              <w:widowControl w:val="false"/>
-              <w:suppressAutoHyphens w:val="true"/>
+              <w:widowControl w:val="0"/>
               <w:spacing w:before="240" w:after="0"/>
-              <w:jc w:val="left"/>
-              <w:rPr>
-                <w:rFonts w:cs=""/>
-                <w:kern w:val="0"/>
-                <w:szCs w:val="22"/>
-                <w:lang w:val="ru-RU" w:bidi="ar-SA"/>
-              </w:rPr>
-            </w:pPr>
-            <w:r>
-              <w:rPr>
-                <w:rFonts w:cs=""/>
-                <w:kern w:val="0"/>
-                <w:sz w:val="22"/>
-                <w:szCs w:val="22"/>
-                <w:lang w:val="en-US" w:bidi="ar-SA"/>
-              </w:rPr>
-              <w:t xml:space="preserve"> </w:t>
-            </w:r>
-            <w:r>
-              <w:rPr>
-                <w:rFonts w:cs=""/>
-                <w:color w:val="C9211E"/>
-                <w:kern w:val="0"/>
-                <w:sz w:val="22"/>
-                <w:szCs w:val="22"/>
-                <w:lang w:val="en-US" w:bidi="ar-SA"/>
-              </w:rPr>
-              <w:t>964 M</w:t>
-            </w:r>
-            <w:r>
-              <w:rPr>
-                <w:rFonts w:cs=""/>
-                <w:color w:val="C9211E"/>
-                <w:kern w:val="0"/>
-                <w:sz w:val="22"/>
-                <w:szCs w:val="22"/>
-                <w:lang w:val="ru-RU" w:bidi="ar-SA"/>
-              </w:rPr>
-              <w:t>б</w:t>
-            </w:r>
-          </w:p>
-          <w:p>
-            <w:pPr>
-              <w:pStyle w:val="Normal"/>
-              <w:widowControl w:val="false"/>
-              <w:suppressAutoHyphens w:val="true"/>
-              <w:spacing w:lineRule="auto" w:line="240" w:before="240" w:after="0"/>
-              <w:jc w:val="left"/>
-              <w:rPr>
-                <w:rFonts w:cs=""/>
-                <w:kern w:val="0"/>
-                <w:sz w:val="22"/>
-                <w:szCs w:val="22"/>
-                <w:lang w:val="ru-RU" w:bidi="ar-SA"/>
-              </w:rPr>
-            </w:pPr>
-            <w:r>
-              <w:rPr>
-                <w:rFonts w:cs=""/>
-                <w:kern w:val="0"/>
-                <w:sz w:val="22"/>
-                <w:szCs w:val="22"/>
-                <w:lang w:val="ru-RU" w:bidi="ar-SA"/>
-              </w:rPr>
-            </w:r>
+            </w:pPr>
+            <w:r>
+              <w:rPr>
+                <w:sz w:val="22"/>
+                <w:lang w:val="en-US"/>
+              </w:rPr>
+              <w:t xml:space="preserve">{{ </w:t>
+            </w:r>
+            <w:r>
+              <w:rPr>
+                <w:sz w:val="22"/>
+                <w:lang w:val="en-US"/>
+              </w:rPr>
+              <w:t>progra</w:t>
+            </w:r>
+            <w:bookmarkStart w:id="0" w:name="_GoBack"/>
+            <w:bookmarkEnd w:id="0"/>
+            <w:r>
+              <w:rPr>
+                <w:sz w:val="22"/>
+                <w:lang w:val="en-US"/>
+              </w:rPr>
+              <w:t>m_size</w:t>
+            </w:r>
+            <w:r>
+              <w:rPr>
+                <w:sz w:val="22"/>
+                <w:lang w:val="en-US"/>
+              </w:rPr>
+              <w:t xml:space="preserve"> }}</w:t>
+            </w:r>
+          </w:p>
+          <w:p>
+            <w:pPr>
+              <w:widowControl w:val="0"/>
+              <w:spacing w:before="240" w:after="0" w:line="240" w:lineRule="auto"/>
+            </w:pPr>
           </w:p>
         </w:tc>
       </w:tr>
     </w:tbl>
     <w:p>
       <w:pPr>
-        <w:pStyle w:val="Normal"/>
-        <w:spacing w:before="0" w:after="200"/>
         <w:jc w:val="center"/>
         <w:rPr>
           <w:b/>
-          <w:b/>
         </w:rPr>
       </w:pPr>
-      <w:r>
-        <w:rPr/>
-      </w:r>
     </w:p>
     <w:sectPr>
-      <w:headerReference w:type="default" r:id="rId2"/>
-      <w:type w:val="nextPage"/>
+      <w:headerReference w:type="default" r:id="rId6"/>
       <w:pgSz w:w="11906" w:h="16838"/>
-      <w:pgMar w:left="1701" w:right="850" w:gutter="0" w:header="1134" w:top="1693" w:footer="0" w:bottom="1134"/>
-      <w:pgNumType w:fmt="decimal"/>
-      <w:formProt w:val="false"/>
-      <w:textDirection w:val="lrTb"/>
-      <w:docGrid w:type="default" w:linePitch="360" w:charSpace="0"/>
+      <w:pgMar w:top="1693" w:right="850" w:bottom="1134" w:left="1701" w:header="1134" w:footer="0" w:gutter="0"/>
+      <w:cols w:space="720"/>
+      <w:formProt w:val="0"/>
+      <w:docGrid w:linePitch="360"/>
     </w:sectPr>
   </w:body>
 </w:document>
 </file>
 
+<file path=word/endnotes.xml><?xml version="1.0" encoding="utf-8"?>
+<w:endnotes xmlns:wpc="http://schemas.microsoft.com/office/word/2010/wordprocessingCanvas" xmlns:cx="http://schemas.microsoft.com/office/drawing/2014/chartex" xmlns:cx1="http://schemas.microsoft.com/office/drawing/2015/9/8/chartex" xmlns:cx2="http://schemas.microsoft.com/office/drawing/2015/10/21/chartex" xmlns:cx3="http://schemas.microsoft.com/office/drawing/2016/5/9/chartex" xmlns:cx4="http://schemas.microsoft.com/office/drawing/2016/5/10/chartex" xmlns:cx5="http://schemas.microsoft.com/office/drawing/2016/5/11/chartex" xmlns:cx6="http://schemas.microsoft.com/office/drawing/2016/5/12/chartex" xmlns:cx7="http://schemas.microsoft.com/office/drawing/2016/5/13/chartex" xmlns:cx8="http://schemas.microsoft.com/office/drawing/2016/5/14/chartex" xmlns:mc="http://schemas.openxmlformats.org/markup-compatibility/2006" xmlns:aink="http://schemas.microsoft.com/office/drawing/2016/ink" xmlns:am3d="http://schemas.microsoft.com/office/drawing/2017/model3d" xmlns:o="urn:schemas-microsoft-com:office:office" xmlns:r="http://schemas.openxmlformats.org/officeDocument/2006/relationships" xmlns:m="http://schemas.openxmlformats.org/officeDocument/2006/math" xmlns:v="urn:schemas-microsoft-com:vml" xmlns:wp14="http://schemas.microsoft.com/office/word/2010/wordprocessingDrawing" xmlns:wp="http://schemas.openxmlformats.org/drawingml/2006/wordprocessingDrawing" xmlns:w10="urn:schemas-microsoft-com:office:word" xmlns:w="http://schemas.openxmlformats.org/wordprocessingml/2006/main" xmlns:w14="http://schemas.microsoft.com/office/word/2010/wordml" xmlns:w15="http://schemas.microsoft.com/office/word/2012/wordml" xmlns:w16cex="http://schemas.microsoft.com/office/word/2018/wordml/cex" xmlns:w16cid="http://schemas.microsoft.com/office/word/2016/wordml/cid" xmlns:w16="http://schemas.microsoft.com/office/word/2018/wordml" xmlns:w16se="http://schemas.microsoft.com/office/word/2015/wordml/symex" xmlns:wpg="http://schemas.microsoft.com/office/word/2010/wordprocessingGroup" xmlns:wpi="http://schemas.microsoft.com/office/word/2010/wordprocessingInk" xmlns:wne="http://schemas.microsoft.com/office/word/2006/wordml" xmlns:wps="http://schemas.microsoft.com/office/word/2010/wordprocessingShape" mc:Ignorable="w14 w15 w16se w16cid w16 w16cex wp14">
+  <w:endnote w:type="separator" w:id="-1">
+    <w:p>
+      <w:pPr>
+        <w:spacing w:after="0" w:line="240" w:lineRule="auto"/>
+      </w:pPr>
+      <w:r>
+        <w:separator/>
+      </w:r>
+    </w:p>
+  </w:endnote>
+  <w:endnote w:type="continuationSeparator" w:id="0">
+    <w:p>
+      <w:pPr>
+        <w:spacing w:after="0" w:line="240" w:lineRule="auto"/>
+      </w:pPr>
+      <w:r>
+        <w:continuationSeparator/>
+      </w:r>
+    </w:p>
+  </w:endnote>
+</w:endnotes>
+</file>
+
+<file path=word/footnotes.xml><?xml version="1.0" encoding="utf-8"?>
+<w:footnotes xmlns:wpc="http://schemas.microsoft.com/office/word/2010/wordprocessingCanvas" xmlns:cx="http://schemas.microsoft.com/office/drawing/2014/chartex" xmlns:cx1="http://schemas.microsoft.com/office/drawing/2015/9/8/chartex" xmlns:cx2="http://schemas.microsoft.com/office/drawing/2015/10/21/chartex" xmlns:cx3="http://schemas.microsoft.com/office/drawing/2016/5/9/chartex" xmlns:cx4="http://schemas.microsoft.com/office/drawing/2016/5/10/chartex" xmlns:cx5="http://schemas.microsoft.com/office/drawing/2016/5/11/chartex" xmlns:cx6="http://schemas.microsoft.com/office/drawing/2016/5/12/chartex" xmlns:cx7="http://schemas.microsoft.com/office/drawing/2016/5/13/chartex" xmlns:cx8="http://schemas.microsoft.com/office/drawing/2016/5/14/chartex" xmlns:mc="http://schemas.openxmlformats.org/markup-compatibility/2006" xmlns:aink="http://schemas.microsoft.com/office/drawing/2016/ink" xmlns:am3d="http://schemas.microsoft.com/office/drawing/2017/model3d" xmlns:o="urn:schemas-microsoft-com:office:office" xmlns:r="http://schemas.openxmlformats.org/officeDocument/2006/relationships" xmlns:m="http://schemas.openxmlformats.org/officeDocument/2006/math" xmlns:v="urn:schemas-microsoft-com:vml" xmlns:wp14="http://schemas.microsoft.com/office/word/2010/wordprocessingDrawing" xmlns:wp="http://schemas.openxmlformats.org/drawingml/2006/wordprocessingDrawing" xmlns:w10="urn:schemas-microsoft-com:office:word" xmlns:w="http://schemas.openxmlformats.org/wordprocessingml/2006/main" xmlns:w14="http://schemas.microsoft.com/office/word/2010/wordml" xmlns:w15="http://schemas.microsoft.com/office/word/2012/wordml" xmlns:w16cex="http://schemas.microsoft.com/office/word/2018/wordml/cex" xmlns:w16cid="http://schemas.microsoft.com/office/word/2016/wordml/cid" xmlns:w16="http://schemas.microsoft.com/office/word/2018/wordml" xmlns:w16se="http://schemas.microsoft.com/office/word/2015/wordml/symex" xmlns:wpg="http://schemas.microsoft.com/office/word/2010/wordprocessingGroup" xmlns:wpi="http://schemas.microsoft.com/office/word/2010/wordprocessingInk" xmlns:wne="http://schemas.microsoft.com/office/word/2006/wordml" xmlns:wps="http://schemas.microsoft.com/office/word/2010/wordprocessingShape" mc:Ignorable="w14 w15 w16se w16cid w16 w16cex wp14">
+  <w:footnote w:type="separator" w:id="-1">
+    <w:p>
+      <w:pPr>
+        <w:spacing w:after="0" w:line="240" w:lineRule="auto"/>
+      </w:pPr>
+      <w:r>
+        <w:separator/>
+      </w:r>
+    </w:p>
+  </w:footnote>
+  <w:footnote w:type="continuationSeparator" w:id="0">
+    <w:p>
+      <w:pPr>
+        <w:spacing w:after="0" w:line="240" w:lineRule="auto"/>
+      </w:pPr>
+      <w:r>
+        <w:continuationSeparator/>
+      </w:r>
+    </w:p>
+  </w:footnote>
+</w:footnotes>
+</file>
+
 <file path=word/header1.xml><?xml version="1.0" encoding="utf-8"?>
-<w:hdr xmlns:o="urn:schemas-microsoft-com:office:office" xmlns:r="http://schemas.openxmlformats.org/officeDocument/2006/relationships" xmlns:v="urn:schemas-microsoft-com:vml" xmlns:w="http://schemas.openxmlformats.org/wordprocessingml/2006/main" xmlns:w10="urn:schemas-microsoft-com:office:word" xmlns:wp="http://schemas.openxmlformats.org/drawingml/2006/wordprocessingDrawing" xmlns:wps="http://schemas.microsoft.com/office/word/2010/wordprocessingShape" xmlns:wpg="http://schemas.microsoft.com/office/word/2010/wordprocessingGroup" xmlns:mc="http://schemas.openxmlformats.org/markup-compatibility/2006" xmlns:wp14="http://schemas.microsoft.com/office/word/2010/wordprocessingDrawing" xmlns:w14="http://schemas.microsoft.com/office/word/2010/wordml" xmlns:w15="http://schemas.microsoft.com/office/word/2012/wordml" mc:Ignorable="w14 wp14 w15">
+<w:hdr xmlns:wpc="http://schemas.microsoft.com/office/word/2010/wordprocessingCanvas" xmlns:cx="http://schemas.microsoft.com/office/drawing/2014/chartex" xmlns:cx1="http://schemas.microsoft.com/office/drawing/2015/9/8/chartex" xmlns:cx2="http://schemas.microsoft.com/office/drawing/2015/10/21/chartex" xmlns:cx3="http://schemas.microsoft.com/office/drawing/2016/5/9/chartex" xmlns:cx4="http://schemas.microsoft.com/office/drawing/2016/5/10/chartex" xmlns:cx5="http://schemas.microsoft.com/office/drawing/2016/5/11/chartex" xmlns:cx6="http://schemas.microsoft.com/office/drawing/2016/5/12/chartex" xmlns:cx7="http://schemas.microsoft.com/office/drawing/2016/5/13/chartex" xmlns:cx8="http://schemas.microsoft.com/office/drawing/2016/5/14/chartex" xmlns:mc="http://schemas.openxmlformats.org/markup-compatibility/2006" xmlns:aink="http://schemas.microsoft.com/office/drawing/2016/ink" xmlns:am3d="http://schemas.microsoft.com/office/drawing/2017/model3d" xmlns:o="urn:schemas-microsoft-com:office:office" xmlns:r="http://schemas.openxmlformats.org/officeDocument/2006/relationships" xmlns:m="http://schemas.openxmlformats.org/officeDocument/2006/math" xmlns:v="urn:schemas-microsoft-com:vml" xmlns:wp14="http://schemas.microsoft.com/office/word/2010/wordprocessingDrawing" xmlns:wp="http://schemas.openxmlformats.org/drawingml/2006/wordprocessingDrawing" xmlns:w10="urn:schemas-microsoft-com:office:word" xmlns:w="http://schemas.openxmlformats.org/wordprocessingml/2006/main" xmlns:w14="http://schemas.microsoft.com/office/word/2010/wordml" xmlns:w15="http://schemas.microsoft.com/office/word/2012/wordml" xmlns:w16cex="http://schemas.microsoft.com/office/word/2018/wordml/cex" xmlns:w16cid="http://schemas.microsoft.com/office/word/2016/wordml/cid" xmlns:w16="http://schemas.microsoft.com/office/word/2018/wordml" xmlns:w16se="http://schemas.microsoft.com/office/word/2015/wordml/symex" xmlns:wpg="http://schemas.microsoft.com/office/word/2010/wordprocessingGroup" xmlns:wpi="http://schemas.microsoft.com/office/word/2010/wordprocessingInk" xmlns:wne="http://schemas.microsoft.com/office/word/2006/wordml" xmlns:wps="http://schemas.microsoft.com/office/word/2010/wordprocessingShape" mc:Ignorable="w14 w15 w16se w16cid w16 w16cex wp14">
   <w:p>
     <w:pPr>
-      <w:pStyle w:val="Style24"/>
-      <w:rPr/>
+      <w:pStyle w:val="a6"/>
     </w:pPr>
-    <w:r>
-      <w:rPr/>
-    </w:r>
   </w:p>
 </w:hdr>
 </file>
 
 <file path=word/styles.xml><?xml version="1.0" encoding="utf-8"?>
-<w:styles xmlns:w="http://schemas.openxmlformats.org/wordprocessingml/2006/main" xmlns:w14="http://schemas.microsoft.com/office/word/2010/wordml" xmlns:mc="http://schemas.openxmlformats.org/markup-compatibility/2006" mc:Ignorable="w14">
+<w:styles xmlns:mc="http://schemas.openxmlformats.org/markup-compatibility/2006" xmlns:r="http://schemas.openxmlformats.org/officeDocument/2006/relationships" xmlns:w="http://schemas.openxmlformats.org/wordprocessingml/2006/main" xmlns:w14="http://schemas.microsoft.com/office/word/2010/wordml" xmlns:w15="http://schemas.microsoft.com/office/word/2012/wordml" xmlns:w16cex="http://schemas.microsoft.com/office/word/2018/wordml/cex" xmlns:w16cid="http://schemas.microsoft.com/office/word/2016/wordml/cid" xmlns:w16="http://schemas.microsoft.com/office/word/2018/wordml" xmlns:w16se="http://schemas.microsoft.com/office/word/2015/wordml/symex" mc:Ignorable="w14 w15 w16se w16cid w16 w16cex">
   <w:docDefaults>
     <w:rPrDefault>
       <w:rPr>
-        <w:rFonts w:ascii="Calibri" w:hAnsi="Calibri" w:eastAsia="Calibri" w:cs="" w:asciiTheme="minorHAnsi" w:cstheme="minorBidi" w:eastAsiaTheme="minorHAnsi" w:hAnsiTheme="minorHAnsi"/>
+        <w:rFonts w:asciiTheme="minorHAnsi" w:eastAsiaTheme="minorHAnsi" w:hAnsiTheme="minorHAnsi" w:cstheme="minorBidi"/>
         <w:sz w:val="22"/>
         <w:szCs w:val="22"/>
         <w:lang w:val="ru-RU" w:eastAsia="en-US" w:bidi="ar-SA"/>
@@ -926,21 +698,21 @@
     </w:rPrDefault>
     <w:pPrDefault>
       <w:pPr>
-        <w:suppressAutoHyphens w:val="true"/>
+        <w:suppressAutoHyphens/>
       </w:pPr>
     </w:pPrDefault>
   </w:docDefaults>
   <w:latentStyles w:defLockedState="0" w:defUIPriority="99" w:defSemiHidden="0" w:defUnhideWhenUsed="0" w:defQFormat="0" w:count="376">
     <w:lsdException w:name="Normal" w:uiPriority="0" w:qFormat="1"/>
     <w:lsdException w:name="heading 1" w:uiPriority="9" w:qFormat="1"/>
-    <w:lsdException w:name="heading 2" w:uiPriority="9" w:semiHidden="1" w:unhideWhenUsed="1" w:qFormat="1"/>
-    <w:lsdException w:name="heading 3" w:uiPriority="9" w:semiHidden="1" w:unhideWhenUsed="1" w:qFormat="1"/>
-    <w:lsdException w:name="heading 4" w:uiPriority="9" w:semiHidden="1" w:unhideWhenUsed="1" w:qFormat="1"/>
-    <w:lsdException w:name="heading 5" w:uiPriority="9" w:semiHidden="1" w:unhideWhenUsed="1" w:qFormat="1"/>
-    <w:lsdException w:name="heading 6" w:uiPriority="9" w:semiHidden="1" w:unhideWhenUsed="1" w:qFormat="1"/>
-    <w:lsdException w:name="heading 7" w:uiPriority="9" w:semiHidden="1" w:unhideWhenUsed="1" w:qFormat="1"/>
-    <w:lsdException w:name="heading 8" w:uiPriority="9" w:semiHidden="1" w:unhideWhenUsed="1" w:qFormat="1"/>
-    <w:lsdException w:name="heading 9" w:uiPriority="9" w:semiHidden="1" w:unhideWhenUsed="1" w:qFormat="1"/>
+    <w:lsdException w:name="heading 2" w:semiHidden="1" w:uiPriority="9" w:unhideWhenUsed="1" w:qFormat="1"/>
+    <w:lsdException w:name="heading 3" w:semiHidden="1" w:uiPriority="9" w:unhideWhenUsed="1" w:qFormat="1"/>
+    <w:lsdException w:name="heading 4" w:semiHidden="1" w:uiPriority="9" w:unhideWhenUsed="1" w:qFormat="1"/>
+    <w:lsdException w:name="heading 5" w:semiHidden="1" w:uiPriority="9" w:unhideWhenUsed="1" w:qFormat="1"/>
+    <w:lsdException w:name="heading 6" w:semiHidden="1" w:uiPriority="9" w:unhideWhenUsed="1" w:qFormat="1"/>
+    <w:lsdException w:name="heading 7" w:semiHidden="1" w:uiPriority="9" w:unhideWhenUsed="1" w:qFormat="1"/>
+    <w:lsdException w:name="heading 8" w:semiHidden="1" w:uiPriority="9" w:unhideWhenUsed="1" w:qFormat="1"/>
+    <w:lsdException w:name="heading 9" w:semiHidden="1" w:uiPriority="9" w:unhideWhenUsed="1" w:qFormat="1"/>
     <w:lsdException w:name="index 1" w:semiHidden="1" w:unhideWhenUsed="1"/>
     <w:lsdException w:name="index 2" w:semiHidden="1" w:unhideWhenUsed="1"/>
     <w:lsdException w:name="index 3" w:semiHidden="1" w:unhideWhenUsed="1"/>
@@ -950,22 +722,22 @@
     <w:lsdException w:name="index 7" w:semiHidden="1" w:unhideWhenUsed="1"/>
     <w:lsdException w:name="index 8" w:semiHidden="1" w:unhideWhenUsed="1"/>
     <w:lsdException w:name="index 9" w:semiHidden="1" w:unhideWhenUsed="1"/>
-    <w:lsdException w:name="toc 1" w:uiPriority="39" w:semiHidden="1" w:unhideWhenUsed="1"/>
-    <w:lsdException w:name="toc 2" w:uiPriority="39" w:semiHidden="1" w:unhideWhenUsed="1"/>
-    <w:lsdException w:name="toc 3" w:uiPriority="39" w:semiHidden="1" w:unhideWhenUsed="1"/>
-    <w:lsdException w:name="toc 4" w:uiPriority="39" w:semiHidden="1" w:unhideWhenUsed="1"/>
-    <w:lsdException w:name="toc 5" w:uiPriority="39" w:semiHidden="1" w:unhideWhenUsed="1"/>
-    <w:lsdException w:name="toc 6" w:uiPriority="39" w:semiHidden="1" w:unhideWhenUsed="1"/>
-    <w:lsdException w:name="toc 7" w:uiPriority="39" w:semiHidden="1" w:unhideWhenUsed="1"/>
-    <w:lsdException w:name="toc 8" w:uiPriority="39" w:semiHidden="1" w:unhideWhenUsed="1"/>
-    <w:lsdException w:name="toc 9" w:uiPriority="39" w:semiHidden="1" w:unhideWhenUsed="1"/>
+    <w:lsdException w:name="toc 1" w:semiHidden="1" w:uiPriority="39" w:unhideWhenUsed="1"/>
+    <w:lsdException w:name="toc 2" w:semiHidden="1" w:uiPriority="39" w:unhideWhenUsed="1"/>
+    <w:lsdException w:name="toc 3" w:semiHidden="1" w:uiPriority="39" w:unhideWhenUsed="1"/>
+    <w:lsdException w:name="toc 4" w:semiHidden="1" w:uiPriority="39" w:unhideWhenUsed="1"/>
+    <w:lsdException w:name="toc 5" w:semiHidden="1" w:uiPriority="39" w:unhideWhenUsed="1"/>
+    <w:lsdException w:name="toc 6" w:semiHidden="1" w:uiPriority="39" w:unhideWhenUsed="1"/>
+    <w:lsdException w:name="toc 7" w:semiHidden="1" w:uiPriority="39" w:unhideWhenUsed="1"/>
+    <w:lsdException w:name="toc 8" w:semiHidden="1" w:uiPriority="39" w:unhideWhenUsed="1"/>
+    <w:lsdException w:name="toc 9" w:semiHidden="1" w:uiPriority="39" w:unhideWhenUsed="1"/>
     <w:lsdException w:name="Normal Indent" w:semiHidden="1" w:unhideWhenUsed="1"/>
     <w:lsdException w:name="footnote text" w:semiHidden="1" w:unhideWhenUsed="1"/>
     <w:lsdException w:name="annotation text" w:semiHidden="1" w:unhideWhenUsed="1"/>
     <w:lsdException w:name="header" w:semiHidden="1" w:unhideWhenUsed="1"/>
     <w:lsdException w:name="footer" w:semiHidden="1" w:unhideWhenUsed="1"/>
     <w:lsdException w:name="index heading" w:semiHidden="1" w:unhideWhenUsed="1"/>
-    <w:lsdException w:name="caption" w:uiPriority="35" w:semiHidden="1" w:unhideWhenUsed="1" w:qFormat="1"/>
+    <w:lsdException w:name="caption" w:semiHidden="1" w:uiPriority="35" w:unhideWhenUsed="1" w:qFormat="1"/>
     <w:lsdException w:name="table of figures" w:semiHidden="1" w:unhideWhenUsed="1"/>
     <w:lsdException w:name="envelope address" w:semiHidden="1" w:unhideWhenUsed="1"/>
     <w:lsdException w:name="envelope return" w:semiHidden="1" w:unhideWhenUsed="1"/>
@@ -996,7 +768,7 @@
     <w:lsdException w:name="Title" w:uiPriority="10" w:qFormat="1"/>
     <w:lsdException w:name="Closing" w:semiHidden="1" w:unhideWhenUsed="1"/>
     <w:lsdException w:name="Signature" w:semiHidden="1" w:unhideWhenUsed="1"/>
-    <w:lsdException w:name="Default Paragraph Font" w:uiPriority="1" w:semiHidden="1" w:unhideWhenUsed="1"/>
+    <w:lsdException w:name="Default Paragraph Font" w:semiHidden="1" w:uiPriority="1" w:unhideWhenUsed="1"/>
     <w:lsdException w:name="Body Text" w:semiHidden="1" w:unhideWhenUsed="1"/>
     <w:lsdException w:name="Body Text Indent" w:semiHidden="1" w:unhideWhenUsed="1"/>
     <w:lsdException w:name="List Continue" w:semiHidden="1" w:unhideWhenUsed="1"/>
@@ -1196,8 +968,8 @@
     <w:lsdException w:name="Subtle Reference" w:uiPriority="31" w:qFormat="1"/>
     <w:lsdException w:name="Intense Reference" w:uiPriority="32" w:qFormat="1"/>
     <w:lsdException w:name="Book Title" w:uiPriority="33" w:qFormat="1"/>
-    <w:lsdException w:name="Bibliography" w:uiPriority="37" w:semiHidden="1" w:unhideWhenUsed="1"/>
-    <w:lsdException w:name="TOC Heading" w:uiPriority="39" w:semiHidden="1" w:unhideWhenUsed="1" w:qFormat="1"/>
+    <w:lsdException w:name="Bibliography" w:semiHidden="1" w:uiPriority="37" w:unhideWhenUsed="1"/>
+    <w:lsdException w:name="TOC Heading" w:semiHidden="1" w:uiPriority="39" w:unhideWhenUsed="1" w:qFormat="1"/>
     <w:lsdException w:name="Plain Table 1" w:uiPriority="41"/>
     <w:lsdException w:name="Plain Table 2" w:uiPriority="42"/>
     <w:lsdException w:name="Plain Table 3" w:uiPriority="43"/>
@@ -1308,150 +1080,119 @@
     <w:lsdException w:name="Unresolved Mention" w:semiHidden="1" w:unhideWhenUsed="1"/>
     <w:lsdException w:name="Smart Link" w:semiHidden="1" w:unhideWhenUsed="1"/>
   </w:latentStyles>
-  <w:style w:type="paragraph" w:styleId="Normal" w:default="1">
+  <w:style w:type="paragraph" w:default="1" w:styleId="a">
     <w:name w:val="Normal"/>
     <w:qFormat/>
-    <w:rsid w:val="00b446d2"/>
+    <w:rsid w:val="00B446D2"/>
     <w:pPr>
-      <w:widowControl/>
-      <w:suppressAutoHyphens w:val="true"/>
-      <w:bidi w:val="0"/>
-      <w:spacing w:lineRule="auto" w:line="276" w:before="0" w:after="200"/>
-      <w:jc w:val="left"/>
+      <w:spacing w:after="200" w:line="276" w:lineRule="auto"/>
     </w:pPr>
     <w:rPr>
-      <w:rFonts w:ascii="Times New Roman" w:hAnsi="Times New Roman" w:eastAsia="" w:cs="" w:eastAsiaTheme="minorEastAsia"/>
-      <w:color w:val="auto"/>
-      <w:kern w:val="0"/>
+      <w:rFonts w:ascii="Times New Roman" w:eastAsiaTheme="minorEastAsia" w:hAnsi="Times New Roman"/>
       <w:sz w:val="24"/>
-      <w:szCs w:val="22"/>
-      <w:lang w:val="ru-RU" w:eastAsia="ru-RU" w:bidi="ar-SA"/>
+      <w:lang w:eastAsia="ru-RU"/>
     </w:rPr>
   </w:style>
-  <w:style w:type="character" w:styleId="DefaultParagraphFont" w:default="1">
+  <w:style w:type="character" w:default="1" w:styleId="a0">
     <w:name w:val="Default Paragraph Font"/>
     <w:uiPriority w:val="1"/>
     <w:semiHidden/>
     <w:unhideWhenUsed/>
-    <w:qFormat/>
-    <w:rPr/>
-  </w:style>
-  <w:style w:type="character" w:styleId="Style14" w:customStyle="1">
+  </w:style>
+  <w:style w:type="table" w:default="1" w:styleId="a1">
+    <w:name w:val="Normal Table"/>
+    <w:uiPriority w:val="99"/>
+    <w:semiHidden/>
+    <w:unhideWhenUsed/>
+    <w:tblPr>
+      <w:tblInd w:w="0" w:type="dxa"/>
+      <w:tblCellMar>
+        <w:top w:w="0" w:type="dxa"/>
+        <w:left w:w="108" w:type="dxa"/>
+        <w:bottom w:w="0" w:type="dxa"/>
+        <w:right w:w="108" w:type="dxa"/>
+      </w:tblCellMar>
+    </w:tblPr>
+  </w:style>
+  <w:style w:type="numbering" w:default="1" w:styleId="a2">
+    <w:name w:val="No List"/>
+    <w:uiPriority w:val="99"/>
+    <w:semiHidden/>
+    <w:unhideWhenUsed/>
+  </w:style>
+  <w:style w:type="character" w:customStyle="1" w:styleId="a3">
     <w:name w:val="Текст выноски Знак"/>
-    <w:basedOn w:val="DefaultParagraphFont"/>
-    <w:link w:val="BalloonText"/>
+    <w:basedOn w:val="a0"/>
+    <w:link w:val="a4"/>
     <w:uiPriority w:val="99"/>
     <w:semiHidden/>
     <w:qFormat/>
-    <w:rsid w:val="000e464c"/>
+    <w:rsid w:val="000E464C"/>
     <w:rPr>
-      <w:rFonts w:ascii="Segoe UI" w:hAnsi="Segoe UI" w:eastAsia="" w:cs="Segoe UI" w:eastAsiaTheme="minorEastAsia"/>
+      <w:rFonts w:ascii="Segoe UI" w:eastAsiaTheme="minorEastAsia" w:hAnsi="Segoe UI" w:cs="Segoe UI"/>
       <w:sz w:val="18"/>
       <w:szCs w:val="18"/>
       <w:lang w:eastAsia="ru-RU"/>
     </w:rPr>
   </w:style>
-  <w:style w:type="character" w:styleId="Style15" w:customStyle="1">
+  <w:style w:type="character" w:customStyle="1" w:styleId="a5">
     <w:name w:val="Верхний колонтитул Знак"/>
-    <w:basedOn w:val="DefaultParagraphFont"/>
+    <w:basedOn w:val="a0"/>
+    <w:link w:val="a6"/>
     <w:uiPriority w:val="99"/>
     <w:qFormat/>
-    <w:rsid w:val="00f80fe4"/>
+    <w:rsid w:val="00F80FE4"/>
     <w:rPr>
-      <w:rFonts w:ascii="Times New Roman" w:hAnsi="Times New Roman" w:eastAsia="" w:eastAsiaTheme="minorEastAsia"/>
+      <w:rFonts w:ascii="Times New Roman" w:eastAsiaTheme="minorEastAsia" w:hAnsi="Times New Roman"/>
       <w:sz w:val="24"/>
       <w:lang w:eastAsia="ru-RU"/>
     </w:rPr>
   </w:style>
-  <w:style w:type="character" w:styleId="Style16" w:customStyle="1">
+  <w:style w:type="character" w:customStyle="1" w:styleId="a7">
     <w:name w:val="Нижний колонтитул Знак"/>
-    <w:basedOn w:val="DefaultParagraphFont"/>
+    <w:basedOn w:val="a0"/>
+    <w:link w:val="a8"/>
     <w:uiPriority w:val="99"/>
     <w:qFormat/>
-    <w:rsid w:val="00f80fe4"/>
+    <w:rsid w:val="00F80FE4"/>
     <w:rPr>
-      <w:rFonts w:ascii="Times New Roman" w:hAnsi="Times New Roman" w:eastAsia="" w:eastAsiaTheme="minorEastAsia"/>
+      <w:rFonts w:ascii="Times New Roman" w:eastAsiaTheme="minorEastAsia" w:hAnsi="Times New Roman"/>
       <w:sz w:val="24"/>
       <w:lang w:eastAsia="ru-RU"/>
     </w:rPr>
   </w:style>
-  <w:style w:type="paragraph" w:styleId="Style17">
-    <w:name w:val="Заголовок"/>
-    <w:basedOn w:val="Normal"/>
-    <w:next w:val="Style18"/>
+  <w:style w:type="paragraph" w:styleId="a9">
+    <w:name w:val="Title"/>
+    <w:basedOn w:val="a"/>
+    <w:next w:val="aa"/>
     <w:qFormat/>
     <w:pPr>
-      <w:keepNext w:val="true"/>
+      <w:keepNext/>
       <w:spacing w:before="240" w:after="120"/>
     </w:pPr>
     <w:rPr>
-      <w:rFonts w:ascii="Liberation Sans" w:hAnsi="Liberation Sans" w:eastAsia="Microsoft YaHei" w:cs="Arial"/>
+      <w:rFonts w:ascii="Liberation Sans" w:eastAsia="Microsoft YaHei" w:hAnsi="Liberation Sans" w:cs="Lucida Sans"/>
       <w:sz w:val="28"/>
       <w:szCs w:val="28"/>
     </w:rPr>
   </w:style>
-  <w:style w:type="paragraph" w:styleId="Style18">
+  <w:style w:type="paragraph" w:styleId="aa">
     <w:name w:val="Body Text"/>
-    <w:basedOn w:val="Normal"/>
+    <w:basedOn w:val="a"/>
     <w:pPr>
-      <w:spacing w:before="0" w:after="140"/>
+      <w:spacing w:after="140"/>
     </w:pPr>
-    <w:rPr/>
-  </w:style>
-  <w:style w:type="paragraph" w:styleId="Style19">
+  </w:style>
+  <w:style w:type="paragraph" w:styleId="ab">
     <w:name w:val="List"/>
-    <w:basedOn w:val="Style18"/>
-    <w:pPr/>
+    <w:basedOn w:val="aa"/>
     <w:rPr>
       <w:rFonts w:cs="Lucida Sans"/>
     </w:rPr>
   </w:style>
-  <w:style w:type="paragraph" w:styleId="Style20">
-    <w:name w:val="Caption"/>
-    <w:basedOn w:val="Normal"/>
-    <w:qFormat/>
-    <w:pPr>
-      <w:suppressLineNumbers/>
-      <w:spacing w:before="120" w:after="120"/>
-    </w:pPr>
-    <w:rPr>
-      <w:rFonts w:cs="Arial"/>
-      <w:i/>
-      <w:iCs/>
-      <w:sz w:val="24"/>
-      <w:szCs w:val="24"/>
-    </w:rPr>
-  </w:style>
-  <w:style w:type="paragraph" w:styleId="Style21">
-    <w:name w:val="Указатель"/>
-    <w:basedOn w:val="Normal"/>
-    <w:qFormat/>
-    <w:pPr>
-      <w:suppressLineNumbers/>
-    </w:pPr>
-    <w:rPr>
-      <w:rFonts w:cs="Arial"/>
-      <w:lang w:val="zxx" w:eastAsia="zxx" w:bidi="zxx"/>
-    </w:rPr>
-  </w:style>
-  <w:style w:type="paragraph" w:styleId="Style22">
-    <w:name w:val="Title"/>
-    <w:basedOn w:val="Normal"/>
-    <w:next w:val="Style18"/>
-    <w:qFormat/>
-    <w:pPr>
-      <w:keepNext w:val="true"/>
-      <w:spacing w:before="240" w:after="120"/>
-    </w:pPr>
-    <w:rPr>
-      <w:rFonts w:ascii="Liberation Sans" w:hAnsi="Liberation Sans" w:eastAsia="Microsoft YaHei" w:cs="Lucida Sans"/>
-      <w:sz w:val="28"/>
-      <w:szCs w:val="28"/>
-    </w:rPr>
-  </w:style>
-  <w:style w:type="paragraph" w:styleId="Caption">
+  <w:style w:type="paragraph" w:styleId="ac">
     <w:name w:val="caption"/>
-    <w:basedOn w:val="Normal"/>
+    <w:basedOn w:val="a"/>
     <w:qFormat/>
     <w:pPr>
       <w:suppressLineNumbers/>
@@ -1464,9 +1205,9 @@
       <w:szCs w:val="24"/>
     </w:rPr>
   </w:style>
-  <w:style w:type="paragraph" w:styleId="Indexheading">
+  <w:style w:type="paragraph" w:styleId="ad">
     <w:name w:val="index heading"/>
-    <w:basedOn w:val="Normal"/>
+    <w:basedOn w:val="a"/>
     <w:qFormat/>
     <w:pPr>
       <w:suppressLineNumbers/>
@@ -1475,17 +1216,17 @@
       <w:rFonts w:cs="Lucida Sans"/>
     </w:rPr>
   </w:style>
-  <w:style w:type="paragraph" w:styleId="BalloonText">
+  <w:style w:type="paragraph" w:styleId="a4">
     <w:name w:val="Balloon Text"/>
-    <w:basedOn w:val="Normal"/>
-    <w:link w:val="Style14"/>
+    <w:basedOn w:val="a"/>
+    <w:link w:val="a3"/>
     <w:uiPriority w:val="99"/>
     <w:semiHidden/>
     <w:unhideWhenUsed/>
     <w:qFormat/>
-    <w:rsid w:val="000e464c"/>
+    <w:rsid w:val="000E464C"/>
     <w:pPr>
-      <w:spacing w:lineRule="auto" w:line="240" w:before="0" w:after="0"/>
+      <w:spacing w:after="0" w:line="240" w:lineRule="auto"/>
     </w:pPr>
     <w:rPr>
       <w:rFonts w:ascii="Segoe UI" w:hAnsi="Segoe UI" w:cs="Segoe UI"/>
@@ -1493,60 +1234,53 @@
       <w:szCs w:val="18"/>
     </w:rPr>
   </w:style>
-  <w:style w:type="paragraph" w:styleId="Style23" w:customStyle="1">
+  <w:style w:type="paragraph" w:customStyle="1" w:styleId="ae">
     <w:name w:val="Колонтитул"/>
-    <w:basedOn w:val="Normal"/>
+    <w:basedOn w:val="a"/>
     <w:qFormat/>
-    <w:pPr/>
-    <w:rPr/>
-  </w:style>
-  <w:style w:type="paragraph" w:styleId="Style24">
-    <w:name w:val="Header"/>
-    <w:basedOn w:val="Normal"/>
-    <w:link w:val="Style15"/>
+  </w:style>
+  <w:style w:type="paragraph" w:styleId="a6">
+    <w:name w:val="header"/>
+    <w:basedOn w:val="a"/>
+    <w:link w:val="a5"/>
     <w:uiPriority w:val="99"/>
     <w:unhideWhenUsed/>
-    <w:rsid w:val="00f80fe4"/>
+    <w:rsid w:val="00F80FE4"/>
     <w:pPr>
       <w:tabs>
-        <w:tab w:val="clear" w:pos="708"/>
-        <w:tab w:val="center" w:pos="4677" w:leader="none"/>
-        <w:tab w:val="right" w:pos="9355" w:leader="none"/>
+        <w:tab w:val="center" w:pos="4677"/>
+        <w:tab w:val="right" w:pos="9355"/>
       </w:tabs>
-      <w:spacing w:lineRule="auto" w:line="240" w:before="0" w:after="0"/>
+      <w:spacing w:after="0" w:line="240" w:lineRule="auto"/>
     </w:pPr>
-    <w:rPr/>
-  </w:style>
-  <w:style w:type="paragraph" w:styleId="Style25">
-    <w:name w:val="Footer"/>
-    <w:basedOn w:val="Normal"/>
-    <w:link w:val="Style16"/>
+  </w:style>
+  <w:style w:type="paragraph" w:styleId="a8">
+    <w:name w:val="footer"/>
+    <w:basedOn w:val="a"/>
+    <w:link w:val="a7"/>
     <w:uiPriority w:val="99"/>
     <w:unhideWhenUsed/>
-    <w:rsid w:val="00f80fe4"/>
+    <w:rsid w:val="00F80FE4"/>
     <w:pPr>
       <w:tabs>
-        <w:tab w:val="clear" w:pos="708"/>
-        <w:tab w:val="center" w:pos="4677" w:leader="none"/>
-        <w:tab w:val="right" w:pos="9355" w:leader="none"/>
+        <w:tab w:val="center" w:pos="4677"/>
+        <w:tab w:val="right" w:pos="9355"/>
       </w:tabs>
-      <w:spacing w:lineRule="auto" w:line="240" w:before="0" w:after="0"/>
+      <w:spacing w:after="0" w:line="240" w:lineRule="auto"/>
     </w:pPr>
-    <w:rPr/>
-  </w:style>
-  <w:style w:type="paragraph" w:styleId="Style26" w:customStyle="1">
+  </w:style>
+  <w:style w:type="paragraph" w:customStyle="1" w:styleId="af">
     <w:name w:val="Содержимое таблицы"/>
-    <w:basedOn w:val="Normal"/>
+    <w:basedOn w:val="a"/>
     <w:qFormat/>
     <w:pPr>
-      <w:widowControl w:val="false"/>
+      <w:widowControl w:val="0"/>
       <w:suppressLineNumbers/>
     </w:pPr>
-    <w:rPr/>
-  </w:style>
-  <w:style w:type="paragraph" w:styleId="Style27" w:customStyle="1">
+  </w:style>
+  <w:style w:type="paragraph" w:customStyle="1" w:styleId="af0">
     <w:name w:val="Заголовок таблицы"/>
-    <w:basedOn w:val="Style26"/>
+    <w:basedOn w:val="af"/>
     <w:qFormat/>
     <w:pPr>
       <w:jc w:val="center"/>
@@ -1556,40 +1290,19 @@
       <w:bCs/>
     </w:rPr>
   </w:style>
-  <w:style w:type="numbering" w:styleId="NoList" w:default="1">
-    <w:name w:val="No List"/>
-    <w:uiPriority w:val="99"/>
-    <w:semiHidden/>
-    <w:unhideWhenUsed/>
-    <w:qFormat/>
-  </w:style>
-  <w:style w:type="table" w:default="1" w:styleId="a1">
-    <w:name w:val="Normal Table"/>
-    <w:uiPriority w:val="99"/>
-    <w:semiHidden/>
-    <w:unhideWhenUsed/>
-    <w:tblPr>
-      <w:tblCellMar>
-        <w:top w:w="0" w:type="dxa"/>
-        <w:left w:w="108" w:type="dxa"/>
-        <w:bottom w:w="0" w:type="dxa"/>
-        <w:right w:w="108" w:type="dxa"/>
-      </w:tblCellMar>
-    </w:tblPr>
-  </w:style>
   <w:style w:type="table" w:styleId="af1">
     <w:name w:val="Table Grid"/>
     <w:basedOn w:val="a1"/>
     <w:uiPriority w:val="59"/>
-    <w:rsid w:val="009d3e99"/>
+    <w:rsid w:val="009D3E99"/>
     <w:tblPr>
       <w:tblBorders>
-        <w:top w:val="single" w:color="000000" w:themeColor="text1" w:sz="4" w:space="0"/>
-        <w:left w:val="single" w:color="000000" w:themeColor="text1" w:sz="4" w:space="0"/>
-        <w:bottom w:val="single" w:color="000000" w:themeColor="text1" w:sz="4" w:space="0"/>
-        <w:right w:val="single" w:color="000000" w:themeColor="text1" w:sz="4" w:space="0"/>
-        <w:insideH w:val="single" w:color="000000" w:themeColor="text1" w:sz="4" w:space="0"/>
-        <w:insideV w:val="single" w:color="000000" w:themeColor="text1" w:sz="4" w:space="0"/>
+        <w:top w:val="single" w:sz="4" w:space="0" w:color="000000" w:themeColor="text1"/>
+        <w:left w:val="single" w:sz="4" w:space="0" w:color="000000" w:themeColor="text1"/>
+        <w:bottom w:val="single" w:sz="4" w:space="0" w:color="000000" w:themeColor="text1"/>
+        <w:right w:val="single" w:sz="4" w:space="0" w:color="000000" w:themeColor="text1"/>
+        <w:insideH w:val="single" w:sz="4" w:space="0" w:color="000000" w:themeColor="text1"/>
+        <w:insideV w:val="single" w:sz="4" w:space="0" w:color="000000" w:themeColor="text1"/>
       </w:tblBorders>
     </w:tblPr>
   </w:style>

</xml_diff>